<commit_message>
Update disciplinary document templates 01-09
</commit_message>
<xml_diff>
--- a/01 - Sanción Incio Expediente.docx
+++ b/01 - Sanción Incio Expediente.docx
@@ -1185,32 +1185,6 @@
       </w:pPr>
     </w:p>
     <w:p>
-      <w:pPr>
-        <w:autoSpaceDE w:val="0"/>
-        <w:autoSpaceDN w:val="0"/>
-        <w:adjustRightInd w:val="0"/>
-        <w:spacing w:after="0" w:line="240" w:lineRule="auto"/>
-        <w:rPr>
-          <w:rFonts w:ascii="Arial" w:hAnsi="Arial" w:cs="Arial"/>
-          <w:sz w:val="16"/>
-          <w:szCs w:val="16"/>
-        </w:rPr>
-      </w:pPr>
-    </w:p>
-    <w:p>
-      <w:pPr>
-        <w:autoSpaceDE w:val="0"/>
-        <w:autoSpaceDN w:val="0"/>
-        <w:adjustRightInd w:val="0"/>
-        <w:spacing w:after="0" w:line="240" w:lineRule="auto"/>
-        <w:rPr>
-          <w:rFonts w:ascii="Arial" w:hAnsi="Arial" w:cs="Arial"/>
-          <w:sz w:val="16"/>
-          <w:szCs w:val="16"/>
-        </w:rPr>
-      </w:pPr>
-    </w:p>
-    <w:p>
       <w:r>
         <w:rPr>
           <w:rFonts w:ascii="Arial" w:hAnsi="Arial" w:cs="Arial"/>
@@ -1243,7 +1217,12 @@
       </w:r>
     </w:p>
     <w:sectPr>
-      <w:headerReference w:type="default" r:id="rId9"/>
+      <w:headerReference w:type="even" r:id="rId9"/>
+      <w:headerReference w:type="default" r:id="rId10"/>
+      <w:footerReference w:type="even" r:id="rId11"/>
+      <w:footerReference w:type="default" r:id="rId12"/>
+      <w:headerReference w:type="first" r:id="rId13"/>
+      <w:footerReference w:type="first" r:id="rId14"/>
       <w:pgSz w:w="11906" w:h="16838"/>
       <w:pgMar w:top="1417" w:right="1701" w:bottom="1417" w:left="1701" w:header="708" w:footer="708" w:gutter="0"/>
       <w:cols w:space="708"/>
@@ -1278,6 +1257,206 @@
 </w:endnotes>
 </file>
 
+<file path=word/footer1.xml><?xml version="1.0" encoding="utf-8"?>
+<w:ftr xmlns:wpc="http://schemas.microsoft.com/office/word/2010/wordprocessingCanvas" xmlns:cx="http://schemas.microsoft.com/office/drawing/2014/chartex" xmlns:cx1="http://schemas.microsoft.com/office/drawing/2015/9/8/chartex" xmlns:cx2="http://schemas.microsoft.com/office/drawing/2015/10/21/chartex" xmlns:cx3="http://schemas.microsoft.com/office/drawing/2016/5/9/chartex" xmlns:cx4="http://schemas.microsoft.com/office/drawing/2016/5/10/chartex" xmlns:cx5="http://schemas.microsoft.com/office/drawing/2016/5/11/chartex" xmlns:cx6="http://schemas.microsoft.com/office/drawing/2016/5/12/chartex" xmlns:cx7="http://schemas.microsoft.com/office/drawing/2016/5/13/chartex" xmlns:cx8="http://schemas.microsoft.com/office/drawing/2016/5/14/chartex" xmlns:mc="http://schemas.openxmlformats.org/markup-compatibility/2006" xmlns:aink="http://schemas.microsoft.com/office/drawing/2016/ink" xmlns:am3d="http://schemas.microsoft.com/office/drawing/2017/model3d" xmlns:o="urn:schemas-microsoft-com:office:office" xmlns:oel="http://schemas.microsoft.com/office/2019/extlst" xmlns:r="http://schemas.openxmlformats.org/officeDocument/2006/relationships" xmlns:m="http://schemas.openxmlformats.org/officeDocument/2006/math" xmlns:v="urn:schemas-microsoft-com:vml" xmlns:wp14="http://schemas.microsoft.com/office/word/2010/wordprocessingDrawing" xmlns:wp="http://schemas.openxmlformats.org/drawingml/2006/wordprocessingDrawing" xmlns:w10="urn:schemas-microsoft-com:office:word" xmlns:w="http://schemas.openxmlformats.org/wordprocessingml/2006/main" xmlns:w14="http://schemas.microsoft.com/office/word/2010/wordml" xmlns:w15="http://schemas.microsoft.com/office/word/2012/wordml" xmlns:w16cex="http://schemas.microsoft.com/office/word/2018/wordml/cex" xmlns:w16cid="http://schemas.microsoft.com/office/word/2016/wordml/cid" xmlns:w16="http://schemas.microsoft.com/office/word/2018/wordml" xmlns:w16du="http://schemas.microsoft.com/office/word/2023/wordml/word16du" xmlns:w16sdtdh="http://schemas.microsoft.com/office/word/2020/wordml/sdtdatahash" xmlns:w16sdtfl="http://schemas.microsoft.com/office/word/2024/wordml/sdtformatlock" xmlns:w16se="http://schemas.microsoft.com/office/word/2015/wordml/symex" xmlns:wpg="http://schemas.microsoft.com/office/word/2010/wordprocessingGroup" xmlns:wpi="http://schemas.microsoft.com/office/word/2010/wordprocessingInk" xmlns:wne="http://schemas.microsoft.com/office/word/2006/wordml" xmlns:wps="http://schemas.microsoft.com/office/word/2010/wordprocessingShape" mc:Ignorable="w14 w15 w16se w16cid w16 w16cex w16sdtdh w16sdtfl w16du wp14">
+  <w:p>
+    <w:pPr>
+      <w:pStyle w:val="Piedepgina"/>
+    </w:pPr>
+  </w:p>
+</w:ftr>
+</file>
+
+<file path=word/footer2.xml><?xml version="1.0" encoding="utf-8"?>
+<w:ftr xmlns:wpc="http://schemas.microsoft.com/office/word/2010/wordprocessingCanvas" xmlns:cx="http://schemas.microsoft.com/office/drawing/2014/chartex" xmlns:cx1="http://schemas.microsoft.com/office/drawing/2015/9/8/chartex" xmlns:cx2="http://schemas.microsoft.com/office/drawing/2015/10/21/chartex" xmlns:cx3="http://schemas.microsoft.com/office/drawing/2016/5/9/chartex" xmlns:cx4="http://schemas.microsoft.com/office/drawing/2016/5/10/chartex" xmlns:cx5="http://schemas.microsoft.com/office/drawing/2016/5/11/chartex" xmlns:cx6="http://schemas.microsoft.com/office/drawing/2016/5/12/chartex" xmlns:cx7="http://schemas.microsoft.com/office/drawing/2016/5/13/chartex" xmlns:cx8="http://schemas.microsoft.com/office/drawing/2016/5/14/chartex" xmlns:mc="http://schemas.openxmlformats.org/markup-compatibility/2006" xmlns:aink="http://schemas.microsoft.com/office/drawing/2016/ink" xmlns:am3d="http://schemas.microsoft.com/office/drawing/2017/model3d" xmlns:o="urn:schemas-microsoft-com:office:office" xmlns:oel="http://schemas.microsoft.com/office/2019/extlst" xmlns:r="http://schemas.openxmlformats.org/officeDocument/2006/relationships" xmlns:m="http://schemas.openxmlformats.org/officeDocument/2006/math" xmlns:v="urn:schemas-microsoft-com:vml" xmlns:wp14="http://schemas.microsoft.com/office/word/2010/wordprocessingDrawing" xmlns:wp="http://schemas.openxmlformats.org/drawingml/2006/wordprocessingDrawing" xmlns:w10="urn:schemas-microsoft-com:office:word" xmlns:w="http://schemas.openxmlformats.org/wordprocessingml/2006/main" xmlns:w14="http://schemas.microsoft.com/office/word/2010/wordml" xmlns:w15="http://schemas.microsoft.com/office/word/2012/wordml" xmlns:w16cex="http://schemas.microsoft.com/office/word/2018/wordml/cex" xmlns:w16cid="http://schemas.microsoft.com/office/word/2016/wordml/cid" xmlns:w16="http://schemas.microsoft.com/office/word/2018/wordml" xmlns:w16du="http://schemas.microsoft.com/office/word/2023/wordml/word16du" xmlns:w16sdtdh="http://schemas.microsoft.com/office/word/2020/wordml/sdtdatahash" xmlns:w16sdtfl="http://schemas.microsoft.com/office/word/2024/wordml/sdtformatlock" xmlns:w16se="http://schemas.microsoft.com/office/word/2015/wordml/symex" xmlns:wpg="http://schemas.microsoft.com/office/word/2010/wordprocessingGroup" xmlns:wpi="http://schemas.microsoft.com/office/word/2010/wordprocessingInk" xmlns:wne="http://schemas.microsoft.com/office/word/2006/wordml" xmlns:wps="http://schemas.microsoft.com/office/word/2010/wordprocessingShape" mc:Ignorable="w14 w15 w16se w16cid w16 w16cex w16sdtdh w16sdtfl w16du wp14">
+  <w:tbl>
+    <w:tblPr>
+      <w:tblW w:w="0" w:type="auto"/>
+      <w:tblLayout w:type="fixed"/>
+      <w:tblLook w:val="0000" w:firstRow="0" w:lastRow="0" w:firstColumn="0" w:lastColumn="0" w:noHBand="0" w:noVBand="0"/>
+    </w:tblPr>
+    <w:tblGrid>
+      <w:gridCol w:w="6062"/>
+      <w:gridCol w:w="3695"/>
+    </w:tblGrid>
+    <w:tr>
+      <w:trPr>
+        <w:trHeight w:val="1251"/>
+      </w:trPr>
+      <w:tc>
+        <w:tcPr>
+          <w:tcW w:w="6062" w:type="dxa"/>
+        </w:tcPr>
+        <w:p>
+          <w:pPr>
+            <w:tabs>
+              <w:tab w:val="center" w:pos="4320"/>
+              <w:tab w:val="right" w:pos="8640"/>
+            </w:tabs>
+            <w:spacing w:after="0" w:line="240" w:lineRule="auto"/>
+            <w:jc w:val="both"/>
+          </w:pPr>
+        </w:p>
+        <w:tbl>
+          <w:tblPr>
+            <w:tblW w:w="0" w:type="auto"/>
+            <w:tblBorders>
+              <w:top w:val="single" w:sz="4" w:space="0" w:color="auto"/>
+              <w:left w:val="single" w:sz="4" w:space="0" w:color="auto"/>
+              <w:bottom w:val="single" w:sz="4" w:space="0" w:color="auto"/>
+              <w:right w:val="single" w:sz="4" w:space="0" w:color="auto"/>
+              <w:insideH w:val="single" w:sz="4" w:space="0" w:color="auto"/>
+              <w:insideV w:val="single" w:sz="4" w:space="0" w:color="auto"/>
+            </w:tblBorders>
+            <w:tblLayout w:type="fixed"/>
+            <w:tblLook w:val="0000" w:firstRow="0" w:lastRow="0" w:firstColumn="0" w:lastColumn="0" w:noHBand="0" w:noVBand="0"/>
+          </w:tblPr>
+          <w:tblGrid>
+            <w:gridCol w:w="5418"/>
+          </w:tblGrid>
+          <w:tr>
+            <w:trPr>
+              <w:trHeight w:val="433"/>
+            </w:trPr>
+            <w:tc>
+              <w:tcPr>
+                <w:tcW w:w="5418" w:type="dxa"/>
+                <w:vAlign w:val="center"/>
+              </w:tcPr>
+              <w:p>
+                <w:pPr>
+                  <w:tabs>
+                    <w:tab w:val="center" w:pos="4320"/>
+                    <w:tab w:val="right" w:pos="8640"/>
+                  </w:tabs>
+                  <w:snapToGrid w:val="0"/>
+                  <w:spacing w:after="0" w:line="240" w:lineRule="auto"/>
+                  <w:jc w:val="both"/>
+                  <w:rPr>
+                    <w:rFonts w:cs="Arial"/>
+                  </w:rPr>
+                </w:pPr>
+                <w:r>
+                  <w:rPr>
+                    <w:rFonts w:cs="Arial"/>
+                  </w:rPr>
+                  <w:t xml:space="preserve">correo electrónico: </w:t>
+                </w:r>
+                <w:r>
+                  <w:rPr>
+                    <w:rFonts w:cs="Arial"/>
+                  </w:rPr>
+                  <w:t>ies.leopoldoqueipo@educacion.gob</w:t>
+                </w:r>
+                <w:r>
+                  <w:rPr>
+                    <w:rFonts w:cs="Arial"/>
+                  </w:rPr>
+                  <w:t>.es</w:t>
+                </w:r>
+              </w:p>
+            </w:tc>
+          </w:tr>
+        </w:tbl>
+        <w:p>
+          <w:pPr>
+            <w:spacing w:after="0" w:line="240" w:lineRule="auto"/>
+            <w:jc w:val="both"/>
+          </w:pPr>
+        </w:p>
+      </w:tc>
+      <w:tc>
+        <w:tcPr>
+          <w:tcW w:w="3695" w:type="dxa"/>
+          <w:tcBorders>
+            <w:left w:val="single" w:sz="4" w:space="0" w:color="000000"/>
+          </w:tcBorders>
+        </w:tcPr>
+        <w:p>
+          <w:pPr>
+            <w:spacing w:after="0" w:line="240" w:lineRule="auto"/>
+            <w:jc w:val="both"/>
+            <w:textAlignment w:val="baseline"/>
+            <w:rPr>
+              <w:rFonts w:cs="Arial"/>
+            </w:rPr>
+          </w:pPr>
+          <w:r>
+            <w:rPr>
+              <w:rFonts w:cs="Arial"/>
+            </w:rPr>
+            <w:t>Plaza 1º de Mayo, 2</w:t>
+          </w:r>
+        </w:p>
+        <w:p>
+          <w:pPr>
+            <w:spacing w:after="0" w:line="240" w:lineRule="auto"/>
+            <w:jc w:val="both"/>
+            <w:textAlignment w:val="baseline"/>
+            <w:rPr>
+              <w:rFonts w:cs="Arial"/>
+            </w:rPr>
+          </w:pPr>
+          <w:r>
+            <w:rPr>
+              <w:rFonts w:cs="Arial"/>
+            </w:rPr>
+            <w:t>52003   Melilla</w:t>
+          </w:r>
+        </w:p>
+        <w:p>
+          <w:pPr>
+            <w:spacing w:after="0" w:line="240" w:lineRule="auto"/>
+            <w:jc w:val="both"/>
+            <w:textAlignment w:val="baseline"/>
+            <w:rPr>
+              <w:rFonts w:cs="Arial"/>
+            </w:rPr>
+          </w:pPr>
+          <w:r>
+            <w:rPr>
+              <w:rFonts w:cs="Arial"/>
+            </w:rPr>
+            <w:t>Tfno.:   952673810</w:t>
+          </w:r>
+        </w:p>
+        <w:p>
+          <w:pPr>
+            <w:spacing w:after="0" w:line="240" w:lineRule="auto"/>
+            <w:jc w:val="both"/>
+            <w:textAlignment w:val="baseline"/>
+            <w:rPr>
+              <w:b/>
+            </w:rPr>
+          </w:pPr>
+          <w:r>
+            <w:rPr>
+              <w:rFonts w:cs="Arial"/>
+            </w:rPr>
+            <w:t>Fax:     952685453</w:t>
+          </w:r>
+        </w:p>
+      </w:tc>
+    </w:tr>
+  </w:tbl>
+  <w:p>
+    <w:pPr>
+      <w:pStyle w:val="Piedepgina"/>
+    </w:pPr>
+  </w:p>
+</w:ftr>
+</file>
+
+<file path=word/footer3.xml><?xml version="1.0" encoding="utf-8"?>
+<w:ftr xmlns:wpc="http://schemas.microsoft.com/office/word/2010/wordprocessingCanvas" xmlns:cx="http://schemas.microsoft.com/office/drawing/2014/chartex" xmlns:cx1="http://schemas.microsoft.com/office/drawing/2015/9/8/chartex" xmlns:cx2="http://schemas.microsoft.com/office/drawing/2015/10/21/chartex" xmlns:cx3="http://schemas.microsoft.com/office/drawing/2016/5/9/chartex" xmlns:cx4="http://schemas.microsoft.com/office/drawing/2016/5/10/chartex" xmlns:cx5="http://schemas.microsoft.com/office/drawing/2016/5/11/chartex" xmlns:cx6="http://schemas.microsoft.com/office/drawing/2016/5/12/chartex" xmlns:cx7="http://schemas.microsoft.com/office/drawing/2016/5/13/chartex" xmlns:cx8="http://schemas.microsoft.com/office/drawing/2016/5/14/chartex" xmlns:mc="http://schemas.openxmlformats.org/markup-compatibility/2006" xmlns:aink="http://schemas.microsoft.com/office/drawing/2016/ink" xmlns:am3d="http://schemas.microsoft.com/office/drawing/2017/model3d" xmlns:o="urn:schemas-microsoft-com:office:office" xmlns:oel="http://schemas.microsoft.com/office/2019/extlst" xmlns:r="http://schemas.openxmlformats.org/officeDocument/2006/relationships" xmlns:m="http://schemas.openxmlformats.org/officeDocument/2006/math" xmlns:v="urn:schemas-microsoft-com:vml" xmlns:wp14="http://schemas.microsoft.com/office/word/2010/wordprocessingDrawing" xmlns:wp="http://schemas.openxmlformats.org/drawingml/2006/wordprocessingDrawing" xmlns:w10="urn:schemas-microsoft-com:office:word" xmlns:w="http://schemas.openxmlformats.org/wordprocessingml/2006/main" xmlns:w14="http://schemas.microsoft.com/office/word/2010/wordml" xmlns:w15="http://schemas.microsoft.com/office/word/2012/wordml" xmlns:w16cex="http://schemas.microsoft.com/office/word/2018/wordml/cex" xmlns:w16cid="http://schemas.microsoft.com/office/word/2016/wordml/cid" xmlns:w16="http://schemas.microsoft.com/office/word/2018/wordml" xmlns:w16du="http://schemas.microsoft.com/office/word/2023/wordml/word16du" xmlns:w16sdtdh="http://schemas.microsoft.com/office/word/2020/wordml/sdtdatahash" xmlns:w16sdtfl="http://schemas.microsoft.com/office/word/2024/wordml/sdtformatlock" xmlns:w16se="http://schemas.microsoft.com/office/word/2015/wordml/symex" xmlns:wpg="http://schemas.microsoft.com/office/word/2010/wordprocessingGroup" xmlns:wpi="http://schemas.microsoft.com/office/word/2010/wordprocessingInk" xmlns:wne="http://schemas.microsoft.com/office/word/2006/wordml" xmlns:wps="http://schemas.microsoft.com/office/word/2010/wordprocessingShape" mc:Ignorable="w14 w15 w16se w16cid w16 w16cex w16sdtdh w16sdtfl w16du wp14">
+  <w:p>
+    <w:pPr>
+      <w:pStyle w:val="Piedepgina"/>
+    </w:pPr>
+  </w:p>
+</w:ftr>
+</file>
+
 <file path=word/footnotes.xml><?xml version="1.0" encoding="utf-8"?>
 <w:footnotes xmlns:wpc="http://schemas.microsoft.com/office/word/2010/wordprocessingCanvas" xmlns:cx="http://schemas.microsoft.com/office/drawing/2014/chartex" xmlns:cx1="http://schemas.microsoft.com/office/drawing/2015/9/8/chartex" xmlns:cx2="http://schemas.microsoft.com/office/drawing/2015/10/21/chartex" xmlns:cx3="http://schemas.microsoft.com/office/drawing/2016/5/9/chartex" xmlns:cx4="http://schemas.microsoft.com/office/drawing/2016/5/10/chartex" xmlns:cx5="http://schemas.microsoft.com/office/drawing/2016/5/11/chartex" xmlns:cx6="http://schemas.microsoft.com/office/drawing/2016/5/12/chartex" xmlns:cx7="http://schemas.microsoft.com/office/drawing/2016/5/13/chartex" xmlns:cx8="http://schemas.microsoft.com/office/drawing/2016/5/14/chartex" xmlns:mc="http://schemas.openxmlformats.org/markup-compatibility/2006" xmlns:aink="http://schemas.microsoft.com/office/drawing/2016/ink" xmlns:am3d="http://schemas.microsoft.com/office/drawing/2017/model3d" xmlns:o="urn:schemas-microsoft-com:office:office" xmlns:oel="http://schemas.microsoft.com/office/2019/extlst" xmlns:r="http://schemas.openxmlformats.org/officeDocument/2006/relationships" xmlns:m="http://schemas.openxmlformats.org/officeDocument/2006/math" xmlns:v="urn:schemas-microsoft-com:vml" xmlns:wp14="http://schemas.microsoft.com/office/word/2010/wordprocessingDrawing" xmlns:wp="http://schemas.openxmlformats.org/drawingml/2006/wordprocessingDrawing" xmlns:w10="urn:schemas-microsoft-com:office:word" xmlns:w="http://schemas.openxmlformats.org/wordprocessingml/2006/main" xmlns:w14="http://schemas.microsoft.com/office/word/2010/wordml" xmlns:w15="http://schemas.microsoft.com/office/word/2012/wordml" xmlns:w16cex="http://schemas.microsoft.com/office/word/2018/wordml/cex" xmlns:w16cid="http://schemas.microsoft.com/office/word/2016/wordml/cid" xmlns:w16="http://schemas.microsoft.com/office/word/2018/wordml" xmlns:w16du="http://schemas.microsoft.com/office/word/2023/wordml/word16du" xmlns:w16sdtdh="http://schemas.microsoft.com/office/word/2020/wordml/sdtdatahash" xmlns:w16sdtfl="http://schemas.microsoft.com/office/word/2024/wordml/sdtformatlock" xmlns:w16se="http://schemas.microsoft.com/office/word/2015/wordml/symex" xmlns:wpg="http://schemas.microsoft.com/office/word/2010/wordprocessingGroup" xmlns:wpi="http://schemas.microsoft.com/office/word/2010/wordprocessingInk" xmlns:wne="http://schemas.microsoft.com/office/word/2006/wordml" xmlns:wps="http://schemas.microsoft.com/office/word/2010/wordprocessingShape" mc:Ignorable="w14 w15 w16se w16cid w16 w16cex w16sdtdh w16sdtfl w16du wp14">
   <w:footnote w:type="separator" w:id="-1">
@@ -1304,6 +1483,16 @@
 </file>
 
 <file path=word/header1.xml><?xml version="1.0" encoding="utf-8"?>
+<w:hdr xmlns:wpc="http://schemas.microsoft.com/office/word/2010/wordprocessingCanvas" xmlns:cx="http://schemas.microsoft.com/office/drawing/2014/chartex" xmlns:cx1="http://schemas.microsoft.com/office/drawing/2015/9/8/chartex" xmlns:cx2="http://schemas.microsoft.com/office/drawing/2015/10/21/chartex" xmlns:cx3="http://schemas.microsoft.com/office/drawing/2016/5/9/chartex" xmlns:cx4="http://schemas.microsoft.com/office/drawing/2016/5/10/chartex" xmlns:cx5="http://schemas.microsoft.com/office/drawing/2016/5/11/chartex" xmlns:cx6="http://schemas.microsoft.com/office/drawing/2016/5/12/chartex" xmlns:cx7="http://schemas.microsoft.com/office/drawing/2016/5/13/chartex" xmlns:cx8="http://schemas.microsoft.com/office/drawing/2016/5/14/chartex" xmlns:mc="http://schemas.openxmlformats.org/markup-compatibility/2006" xmlns:aink="http://schemas.microsoft.com/office/drawing/2016/ink" xmlns:am3d="http://schemas.microsoft.com/office/drawing/2017/model3d" xmlns:o="urn:schemas-microsoft-com:office:office" xmlns:oel="http://schemas.microsoft.com/office/2019/extlst" xmlns:r="http://schemas.openxmlformats.org/officeDocument/2006/relationships" xmlns:m="http://schemas.openxmlformats.org/officeDocument/2006/math" xmlns:v="urn:schemas-microsoft-com:vml" xmlns:wp14="http://schemas.microsoft.com/office/word/2010/wordprocessingDrawing" xmlns:wp="http://schemas.openxmlformats.org/drawingml/2006/wordprocessingDrawing" xmlns:w10="urn:schemas-microsoft-com:office:word" xmlns:w="http://schemas.openxmlformats.org/wordprocessingml/2006/main" xmlns:w14="http://schemas.microsoft.com/office/word/2010/wordml" xmlns:w15="http://schemas.microsoft.com/office/word/2012/wordml" xmlns:w16cex="http://schemas.microsoft.com/office/word/2018/wordml/cex" xmlns:w16cid="http://schemas.microsoft.com/office/word/2016/wordml/cid" xmlns:w16="http://schemas.microsoft.com/office/word/2018/wordml" xmlns:w16du="http://schemas.microsoft.com/office/word/2023/wordml/word16du" xmlns:w16sdtdh="http://schemas.microsoft.com/office/word/2020/wordml/sdtdatahash" xmlns:w16sdtfl="http://schemas.microsoft.com/office/word/2024/wordml/sdtformatlock" xmlns:w16se="http://schemas.microsoft.com/office/word/2015/wordml/symex" xmlns:wpg="http://schemas.microsoft.com/office/word/2010/wordprocessingGroup" xmlns:wpi="http://schemas.microsoft.com/office/word/2010/wordprocessingInk" xmlns:wne="http://schemas.microsoft.com/office/word/2006/wordml" xmlns:wps="http://schemas.microsoft.com/office/word/2010/wordprocessingShape" mc:Ignorable="w14 w15 w16se w16cid w16 w16cex w16sdtdh w16sdtfl w16du wp14">
+  <w:p>
+    <w:pPr>
+      <w:pStyle w:val="Encabezado"/>
+    </w:pPr>
+  </w:p>
+</w:hdr>
+</file>
+
+<file path=word/header2.xml><?xml version="1.0" encoding="utf-8"?>
 <w:hdr xmlns:wpc="http://schemas.microsoft.com/office/word/2010/wordprocessingCanvas" xmlns:cx="http://schemas.microsoft.com/office/drawing/2014/chartex" xmlns:cx1="http://schemas.microsoft.com/office/drawing/2015/9/8/chartex" xmlns:cx2="http://schemas.microsoft.com/office/drawing/2015/10/21/chartex" xmlns:cx3="http://schemas.microsoft.com/office/drawing/2016/5/9/chartex" xmlns:cx4="http://schemas.microsoft.com/office/drawing/2016/5/10/chartex" xmlns:cx5="http://schemas.microsoft.com/office/drawing/2016/5/11/chartex" xmlns:cx6="http://schemas.microsoft.com/office/drawing/2016/5/12/chartex" xmlns:cx7="http://schemas.microsoft.com/office/drawing/2016/5/13/chartex" xmlns:cx8="http://schemas.microsoft.com/office/drawing/2016/5/14/chartex" xmlns:mc="http://schemas.openxmlformats.org/markup-compatibility/2006" xmlns:aink="http://schemas.microsoft.com/office/drawing/2016/ink" xmlns:am3d="http://schemas.microsoft.com/office/drawing/2017/model3d" xmlns:o="urn:schemas-microsoft-com:office:office" xmlns:oel="http://schemas.microsoft.com/office/2019/extlst" xmlns:r="http://schemas.openxmlformats.org/officeDocument/2006/relationships" xmlns:m="http://schemas.openxmlformats.org/officeDocument/2006/math" xmlns:v="urn:schemas-microsoft-com:vml" xmlns:wp14="http://schemas.microsoft.com/office/word/2010/wordprocessingDrawing" xmlns:wp="http://schemas.openxmlformats.org/drawingml/2006/wordprocessingDrawing" xmlns:w10="urn:schemas-microsoft-com:office:word" xmlns:w="http://schemas.openxmlformats.org/wordprocessingml/2006/main" xmlns:w14="http://schemas.microsoft.com/office/word/2010/wordml" xmlns:w15="http://schemas.microsoft.com/office/word/2012/wordml" xmlns:w16cex="http://schemas.microsoft.com/office/word/2018/wordml/cex" xmlns:w16cid="http://schemas.microsoft.com/office/word/2016/wordml/cid" xmlns:w16="http://schemas.microsoft.com/office/word/2018/wordml" xmlns:w16du="http://schemas.microsoft.com/office/word/2023/wordml/word16du" xmlns:w16sdtdh="http://schemas.microsoft.com/office/word/2020/wordml/sdtdatahash" xmlns:w16sdtfl="http://schemas.microsoft.com/office/word/2024/wordml/sdtformatlock" xmlns:w16se="http://schemas.microsoft.com/office/word/2015/wordml/symex" xmlns:wpg="http://schemas.microsoft.com/office/word/2010/wordprocessingGroup" xmlns:wpi="http://schemas.microsoft.com/office/word/2010/wordprocessingInk" xmlns:wne="http://schemas.microsoft.com/office/word/2006/wordml" xmlns:wps="http://schemas.microsoft.com/office/word/2010/wordprocessingShape" mc:Ignorable="w14 w15 w16se w16cid w16 w16cex w16sdtdh w16sdtfl w16du wp14">
   <w:p>
     <w:pPr>
@@ -1433,6 +1622,16 @@
         </wp:anchor>
       </w:drawing>
     </w:r>
+  </w:p>
+</w:hdr>
+</file>
+
+<file path=word/header3.xml><?xml version="1.0" encoding="utf-8"?>
+<w:hdr xmlns:wpc="http://schemas.microsoft.com/office/word/2010/wordprocessingCanvas" xmlns:cx="http://schemas.microsoft.com/office/drawing/2014/chartex" xmlns:cx1="http://schemas.microsoft.com/office/drawing/2015/9/8/chartex" xmlns:cx2="http://schemas.microsoft.com/office/drawing/2015/10/21/chartex" xmlns:cx3="http://schemas.microsoft.com/office/drawing/2016/5/9/chartex" xmlns:cx4="http://schemas.microsoft.com/office/drawing/2016/5/10/chartex" xmlns:cx5="http://schemas.microsoft.com/office/drawing/2016/5/11/chartex" xmlns:cx6="http://schemas.microsoft.com/office/drawing/2016/5/12/chartex" xmlns:cx7="http://schemas.microsoft.com/office/drawing/2016/5/13/chartex" xmlns:cx8="http://schemas.microsoft.com/office/drawing/2016/5/14/chartex" xmlns:mc="http://schemas.openxmlformats.org/markup-compatibility/2006" xmlns:aink="http://schemas.microsoft.com/office/drawing/2016/ink" xmlns:am3d="http://schemas.microsoft.com/office/drawing/2017/model3d" xmlns:o="urn:schemas-microsoft-com:office:office" xmlns:oel="http://schemas.microsoft.com/office/2019/extlst" xmlns:r="http://schemas.openxmlformats.org/officeDocument/2006/relationships" xmlns:m="http://schemas.openxmlformats.org/officeDocument/2006/math" xmlns:v="urn:schemas-microsoft-com:vml" xmlns:wp14="http://schemas.microsoft.com/office/word/2010/wordprocessingDrawing" xmlns:wp="http://schemas.openxmlformats.org/drawingml/2006/wordprocessingDrawing" xmlns:w10="urn:schemas-microsoft-com:office:word" xmlns:w="http://schemas.openxmlformats.org/wordprocessingml/2006/main" xmlns:w14="http://schemas.microsoft.com/office/word/2010/wordml" xmlns:w15="http://schemas.microsoft.com/office/word/2012/wordml" xmlns:w16cex="http://schemas.microsoft.com/office/word/2018/wordml/cex" xmlns:w16cid="http://schemas.microsoft.com/office/word/2016/wordml/cid" xmlns:w16="http://schemas.microsoft.com/office/word/2018/wordml" xmlns:w16du="http://schemas.microsoft.com/office/word/2023/wordml/word16du" xmlns:w16sdtdh="http://schemas.microsoft.com/office/word/2020/wordml/sdtdatahash" xmlns:w16sdtfl="http://schemas.microsoft.com/office/word/2024/wordml/sdtformatlock" xmlns:w16se="http://schemas.microsoft.com/office/word/2015/wordml/symex" xmlns:wpg="http://schemas.microsoft.com/office/word/2010/wordprocessingGroup" xmlns:wpi="http://schemas.microsoft.com/office/word/2010/wordprocessingInk" xmlns:wne="http://schemas.microsoft.com/office/word/2006/wordml" xmlns:wps="http://schemas.microsoft.com/office/word/2010/wordprocessingShape" mc:Ignorable="w14 w15 w16se w16cid w16 w16cex w16sdtdh w16sdtfl w16du wp14">
+  <w:p>
+    <w:pPr>
+      <w:pStyle w:val="Encabezado"/>
+    </w:pPr>
   </w:p>
 </w:hdr>
 </file>
@@ -2192,25 +2391,6 @@
 </file>
 
 <file path=customXml/item1.xml><?xml version="1.0" encoding="utf-8"?>
-<?mso-contentType ?>
-<FormTemplates xmlns="http://schemas.microsoft.com/sharepoint/v3/contenttype/forms">
-  <Display>DocumentLibraryForm</Display>
-  <Edit>DocumentLibraryForm</Edit>
-  <New>DocumentLibraryForm</New>
-</FormTemplates>
-</file>
-
-<file path=customXml/item2.xml><?xml version="1.0" encoding="utf-8"?>
-<p:properties xmlns:p="http://schemas.microsoft.com/office/2006/metadata/properties" xmlns:xsi="http://www.w3.org/2001/XMLSchema-instance" xmlns:pc="http://schemas.microsoft.com/office/infopath/2007/PartnerControls">
-  <documentManagement>
-    <lcf76f155ced4ddcb4097134ff3c332f xmlns="c8a3e049-7505-4416-9a92-b091f6792637">
-      <Terms xmlns="http://schemas.microsoft.com/office/infopath/2007/PartnerControls"/>
-    </lcf76f155ced4ddcb4097134ff3c332f>
-  </documentManagement>
-</p:properties>
-</file>
-
-<file path=customXml/item3.xml><?xml version="1.0" encoding="utf-8"?>
 <ct:contentTypeSchema xmlns:ct="http://schemas.microsoft.com/office/2006/metadata/contentType" xmlns:ma="http://schemas.microsoft.com/office/2006/metadata/properties/metaAttributes" ct:_="" ma:_="" ma:contentTypeName="Documento" ma:contentTypeID="0x010100BE5E44177913B140848DC48051328551" ma:contentTypeVersion="10" ma:contentTypeDescription="Crear nuevo documento." ma:contentTypeScope="" ma:versionID="e56293935e30344837f372b4cf6c3dd2">
   <xsd:schema xmlns:xsd="http://www.w3.org/2001/XMLSchema" xmlns:xs="http://www.w3.org/2001/XMLSchema" xmlns:p="http://schemas.microsoft.com/office/2006/metadata/properties" xmlns:ns2="c8a3e049-7505-4416-9a92-b091f6792637" targetNamespace="http://schemas.microsoft.com/office/2006/metadata/properties" ma:root="true" ma:fieldsID="dd180e20af6143d6ed5990269d1f6a3c" ns2:_="">
     <xsd:import namespace="c8a3e049-7505-4416-9a92-b091f6792637"/>
@@ -2388,10 +2568,39 @@
 </ct:contentTypeSchema>
 </file>
 
+<file path=customXml/item2.xml><?xml version="1.0" encoding="utf-8"?>
+<p:properties xmlns:p="http://schemas.microsoft.com/office/2006/metadata/properties" xmlns:xsi="http://www.w3.org/2001/XMLSchema-instance" xmlns:pc="http://schemas.microsoft.com/office/infopath/2007/PartnerControls">
+  <documentManagement>
+    <lcf76f155ced4ddcb4097134ff3c332f xmlns="c8a3e049-7505-4416-9a92-b091f6792637">
+      <Terms xmlns="http://schemas.microsoft.com/office/infopath/2007/PartnerControls"/>
+    </lcf76f155ced4ddcb4097134ff3c332f>
+  </documentManagement>
+</p:properties>
+</file>
+
+<file path=customXml/item3.xml><?xml version="1.0" encoding="utf-8"?>
+<?mso-contentType ?>
+<FormTemplates xmlns="http://schemas.microsoft.com/sharepoint/v3/contenttype/forms">
+  <Display>DocumentLibraryForm</Display>
+  <Edit>DocumentLibraryForm</Edit>
+  <New>DocumentLibraryForm</New>
+</FormTemplates>
+</file>
+
 <file path=customXml/itemProps1.xml><?xml version="1.0" encoding="utf-8"?>
-<ds:datastoreItem xmlns:ds="http://schemas.openxmlformats.org/officeDocument/2006/customXml" ds:itemID="{D61C9197-6EA3-43EA-BE01-C71ABA224B03}">
+<ds:datastoreItem xmlns:ds="http://schemas.openxmlformats.org/officeDocument/2006/customXml" ds:itemID="{041939B1-E4EA-4FE9-B833-C78C58B8169E}">
   <ds:schemaRefs>
-    <ds:schemaRef ds:uri="http://schemas.microsoft.com/sharepoint/v3/contenttype/forms"/>
+    <ds:schemaRef ds:uri="http://schemas.microsoft.com/office/2006/metadata/contentType"/>
+    <ds:schemaRef ds:uri="http://schemas.microsoft.com/office/2006/metadata/properties/metaAttributes"/>
+    <ds:schemaRef ds:uri="http://www.w3.org/2001/XMLSchema"/>
+    <ds:schemaRef ds:uri="http://schemas.microsoft.com/office/2006/metadata/properties"/>
+    <ds:schemaRef ds:uri="c8a3e049-7505-4416-9a92-b091f6792637"/>
+    <ds:schemaRef ds:uri="http://schemas.microsoft.com/office/2006/documentManagement/types"/>
+    <ds:schemaRef ds:uri="http://schemas.microsoft.com/office/infopath/2007/PartnerControls"/>
+    <ds:schemaRef ds:uri="http://schemas.openxmlformats.org/package/2006/metadata/core-properties"/>
+    <ds:schemaRef ds:uri="http://purl.org/dc/elements/1.1/"/>
+    <ds:schemaRef ds:uri="http://purl.org/dc/terms/"/>
+    <ds:schemaRef ds:uri="http://schemas.microsoft.com/internal/obd"/>
   </ds:schemaRefs>
 </ds:datastoreItem>
 </file>
@@ -2407,19 +2616,9 @@
 </file>
 
 <file path=customXml/itemProps3.xml><?xml version="1.0" encoding="utf-8"?>
-<ds:datastoreItem xmlns:ds="http://schemas.openxmlformats.org/officeDocument/2006/customXml" ds:itemID="{041939B1-E4EA-4FE9-B833-C78C58B8169E}">
+<ds:datastoreItem xmlns:ds="http://schemas.openxmlformats.org/officeDocument/2006/customXml" ds:itemID="{D61C9197-6EA3-43EA-BE01-C71ABA224B03}">
   <ds:schemaRefs>
-    <ds:schemaRef ds:uri="http://schemas.microsoft.com/office/2006/metadata/contentType"/>
-    <ds:schemaRef ds:uri="http://schemas.microsoft.com/office/2006/metadata/properties/metaAttributes"/>
-    <ds:schemaRef ds:uri="http://www.w3.org/2001/XMLSchema"/>
-    <ds:schemaRef ds:uri="http://schemas.microsoft.com/office/2006/metadata/properties"/>
-    <ds:schemaRef ds:uri="c8a3e049-7505-4416-9a92-b091f6792637"/>
-    <ds:schemaRef ds:uri="http://schemas.microsoft.com/office/2006/documentManagement/types"/>
-    <ds:schemaRef ds:uri="http://schemas.microsoft.com/office/infopath/2007/PartnerControls"/>
-    <ds:schemaRef ds:uri="http://schemas.openxmlformats.org/package/2006/metadata/core-properties"/>
-    <ds:schemaRef ds:uri="http://purl.org/dc/elements/1.1/"/>
-    <ds:schemaRef ds:uri="http://purl.org/dc/terms/"/>
-    <ds:schemaRef ds:uri="http://schemas.microsoft.com/internal/obd"/>
+    <ds:schemaRef ds:uri="http://schemas.microsoft.com/sharepoint/v3/contenttype/forms"/>
   </ds:schemaRefs>
 </ds:datastoreItem>
 </file>
</xml_diff>

<commit_message>
Update disciplinary templates with firmaVisible field
</commit_message>
<xml_diff>
--- a/01 - Sanción Incio Expediente.docx
+++ b/01 - Sanción Incio Expediente.docx
@@ -825,6 +825,32 @@
           <w:szCs w:val="16"/>
         </w:rPr>
       </w:pPr>
+      <w:r>
+        <w:rPr>
+          <w:rFonts w:ascii="Arial" w:hAnsi="Arial" w:cs="Arial"/>
+          <w:sz w:val="16"/>
+          <w:szCs w:val="16"/>
+        </w:rPr>
+        <w:t>&lt;&lt;</w:t>
+      </w:r>
+      <w:proofErr w:type="spellStart"/>
+      <w:r>
+        <w:rPr>
+          <w:rFonts w:ascii="Arial" w:hAnsi="Arial" w:cs="Arial"/>
+          <w:sz w:val="16"/>
+          <w:szCs w:val="16"/>
+        </w:rPr>
+        <w:t>firmaVisible</w:t>
+      </w:r>
+      <w:proofErr w:type="spellEnd"/>
+      <w:r>
+        <w:rPr>
+          <w:rFonts w:ascii="Arial" w:hAnsi="Arial" w:cs="Arial"/>
+          <w:sz w:val="16"/>
+          <w:szCs w:val="16"/>
+        </w:rPr>
+        <w:t>&gt;&gt;</w:t>
+      </w:r>
     </w:p>
     <w:p>
       <w:pPr>
@@ -2286,25 +2312,6 @@
 </file>
 
 <file path=customXml/item1.xml><?xml version="1.0" encoding="utf-8"?>
-<p:properties xmlns:p="http://schemas.microsoft.com/office/2006/metadata/properties" xmlns:xsi="http://www.w3.org/2001/XMLSchema-instance" xmlns:pc="http://schemas.microsoft.com/office/infopath/2007/PartnerControls">
-  <documentManagement>
-    <lcf76f155ced4ddcb4097134ff3c332f xmlns="c8a3e049-7505-4416-9a92-b091f6792637">
-      <Terms xmlns="http://schemas.microsoft.com/office/infopath/2007/PartnerControls"/>
-    </lcf76f155ced4ddcb4097134ff3c332f>
-  </documentManagement>
-</p:properties>
-</file>
-
-<file path=customXml/item2.xml><?xml version="1.0" encoding="utf-8"?>
-<?mso-contentType ?>
-<FormTemplates xmlns="http://schemas.microsoft.com/sharepoint/v3/contenttype/forms">
-  <Display>DocumentLibraryForm</Display>
-  <Edit>DocumentLibraryForm</Edit>
-  <New>DocumentLibraryForm</New>
-</FormTemplates>
-</file>
-
-<file path=customXml/item3.xml><?xml version="1.0" encoding="utf-8"?>
 <ct:contentTypeSchema xmlns:ct="http://schemas.microsoft.com/office/2006/metadata/contentType" xmlns:ma="http://schemas.microsoft.com/office/2006/metadata/properties/metaAttributes" ct:_="" ma:_="" ma:contentTypeName="Documento" ma:contentTypeID="0x010100BE5E44177913B140848DC48051328551" ma:contentTypeVersion="10" ma:contentTypeDescription="Crear nuevo documento." ma:contentTypeScope="" ma:versionID="e56293935e30344837f372b4cf6c3dd2">
   <xsd:schema xmlns:xsd="http://www.w3.org/2001/XMLSchema" xmlns:xs="http://www.w3.org/2001/XMLSchema" xmlns:p="http://schemas.microsoft.com/office/2006/metadata/properties" xmlns:ns2="c8a3e049-7505-4416-9a92-b091f6792637" targetNamespace="http://schemas.microsoft.com/office/2006/metadata/properties" ma:root="true" ma:fieldsID="dd180e20af6143d6ed5990269d1f6a3c" ns2:_="">
     <xsd:import namespace="c8a3e049-7505-4416-9a92-b091f6792637"/>
@@ -2482,25 +2489,26 @@
 </ct:contentTypeSchema>
 </file>
 
-<file path=customXml/itemProps1.xml><?xml version="1.0" encoding="utf-8"?>
-<ds:datastoreItem xmlns:ds="http://schemas.openxmlformats.org/officeDocument/2006/customXml" ds:itemID="{8A1EC71C-7278-4122-A4AD-C66384243BA9}">
-  <ds:schemaRefs>
-    <ds:schemaRef ds:uri="http://schemas.microsoft.com/office/2006/metadata/properties"/>
-    <ds:schemaRef ds:uri="http://schemas.microsoft.com/office/infopath/2007/PartnerControls"/>
-    <ds:schemaRef ds:uri="c8a3e049-7505-4416-9a92-b091f6792637"/>
-  </ds:schemaRefs>
-</ds:datastoreItem>
+<file path=customXml/item2.xml><?xml version="1.0" encoding="utf-8"?>
+<?mso-contentType ?>
+<FormTemplates xmlns="http://schemas.microsoft.com/sharepoint/v3/contenttype/forms">
+  <Display>DocumentLibraryForm</Display>
+  <Edit>DocumentLibraryForm</Edit>
+  <New>DocumentLibraryForm</New>
+</FormTemplates>
 </file>
 
-<file path=customXml/itemProps2.xml><?xml version="1.0" encoding="utf-8"?>
-<ds:datastoreItem xmlns:ds="http://schemas.openxmlformats.org/officeDocument/2006/customXml" ds:itemID="{D61C9197-6EA3-43EA-BE01-C71ABA224B03}">
-  <ds:schemaRefs>
-    <ds:schemaRef ds:uri="http://schemas.microsoft.com/sharepoint/v3/contenttype/forms"/>
-  </ds:schemaRefs>
-</ds:datastoreItem>
+<file path=customXml/item3.xml><?xml version="1.0" encoding="utf-8"?>
+<p:properties xmlns:p="http://schemas.microsoft.com/office/2006/metadata/properties" xmlns:xsi="http://www.w3.org/2001/XMLSchema-instance" xmlns:pc="http://schemas.microsoft.com/office/infopath/2007/PartnerControls">
+  <documentManagement>
+    <lcf76f155ced4ddcb4097134ff3c332f xmlns="c8a3e049-7505-4416-9a92-b091f6792637">
+      <Terms xmlns="http://schemas.microsoft.com/office/infopath/2007/PartnerControls"/>
+    </lcf76f155ced4ddcb4097134ff3c332f>
+  </documentManagement>
+</p:properties>
 </file>
 
-<file path=customXml/itemProps3.xml><?xml version="1.0" encoding="utf-8"?>
+<file path=customXml/itemProps1.xml><?xml version="1.0" encoding="utf-8"?>
 <ds:datastoreItem xmlns:ds="http://schemas.openxmlformats.org/officeDocument/2006/customXml" ds:itemID="{041939B1-E4EA-4FE9-B833-C78C58B8169E}">
   <ds:schemaRefs>
     <ds:schemaRef ds:uri="http://schemas.microsoft.com/office/2006/metadata/contentType"/>
@@ -2516,4 +2524,22 @@
     <ds:schemaRef ds:uri="http://schemas.microsoft.com/internal/obd"/>
   </ds:schemaRefs>
 </ds:datastoreItem>
+</file>
+
+<file path=customXml/itemProps2.xml><?xml version="1.0" encoding="utf-8"?>
+<ds:datastoreItem xmlns:ds="http://schemas.openxmlformats.org/officeDocument/2006/customXml" ds:itemID="{D61C9197-6EA3-43EA-BE01-C71ABA224B03}">
+  <ds:schemaRefs>
+    <ds:schemaRef ds:uri="http://schemas.microsoft.com/sharepoint/v3/contenttype/forms"/>
+  </ds:schemaRefs>
+</ds:datastoreItem>
+</file>
+
+<file path=customXml/itemProps3.xml><?xml version="1.0" encoding="utf-8"?>
+<ds:datastoreItem xmlns:ds="http://schemas.openxmlformats.org/officeDocument/2006/customXml" ds:itemID="{8A1EC71C-7278-4122-A4AD-C66384243BA9}">
+  <ds:schemaRefs>
+    <ds:schemaRef ds:uri="http://schemas.microsoft.com/office/2006/metadata/properties"/>
+    <ds:schemaRef ds:uri="http://schemas.microsoft.com/office/infopath/2007/PartnerControls"/>
+    <ds:schemaRef ds:uri="c8a3e049-7505-4416-9a92-b091f6792637"/>
+  </ds:schemaRefs>
+</ds:datastoreItem>
 </file>
</xml_diff>

<commit_message>
Update template 01 for firmaVisible layout
</commit_message>
<xml_diff>
--- a/01 - Sanción Incio Expediente.docx
+++ b/01 - Sanción Incio Expediente.docx
@@ -263,59 +263,40 @@
           <w:sz w:val="20"/>
           <w:szCs w:val="20"/>
         </w:rPr>
+        <w:t>&lt;&lt;cursoAlumno&gt;&gt;</w:t>
+      </w:r>
+      <w:r>
+        <w:rPr>
+          <w:rFonts w:ascii="Arial" w:hAnsi="Arial" w:cs="Arial"/>
+          <w:sz w:val="20"/>
+          <w:szCs w:val="20"/>
+        </w:rPr>
+        <w:t xml:space="preserve"> </w:t>
+      </w:r>
+      <w:r>
+        <w:rPr>
+          <w:rFonts w:ascii="Arial" w:hAnsi="Arial" w:cs="Arial"/>
+          <w:sz w:val="20"/>
+          <w:szCs w:val="20"/>
+        </w:rPr>
+        <w:t>curso de EDUCACIÓN SECU</w:t>
+      </w:r>
+      <w:r>
+        <w:rPr>
+          <w:rFonts w:ascii="Arial" w:hAnsi="Arial" w:cs="Arial"/>
+          <w:sz w:val="20"/>
+          <w:szCs w:val="20"/>
+        </w:rPr>
+        <w:t>NDARIA OBLIGATORIA (LOMLOE)(</w:t>
+      </w:r>
+      <w:r>
+        <w:rPr>
+          <w:rFonts w:ascii="Arial" w:hAnsi="Arial" w:cs="Arial"/>
+          <w:sz w:val="20"/>
+          <w:szCs w:val="20"/>
+        </w:rPr>
         <w:t>&lt;&lt;</w:t>
       </w:r>
-      <w:proofErr w:type="spellStart"/>
-      <w:r>
-        <w:rPr>
-          <w:rFonts w:ascii="Arial" w:hAnsi="Arial" w:cs="Arial"/>
-          <w:sz w:val="20"/>
-          <w:szCs w:val="20"/>
-        </w:rPr>
-        <w:t>cursoAlumno</w:t>
-      </w:r>
-      <w:proofErr w:type="spellEnd"/>
-      <w:r>
-        <w:rPr>
-          <w:rFonts w:ascii="Arial" w:hAnsi="Arial" w:cs="Arial"/>
-          <w:sz w:val="20"/>
-          <w:szCs w:val="20"/>
-        </w:rPr>
-        <w:t>&gt;&gt;</w:t>
-      </w:r>
-      <w:r>
-        <w:rPr>
-          <w:rFonts w:ascii="Arial" w:hAnsi="Arial" w:cs="Arial"/>
-          <w:sz w:val="20"/>
-          <w:szCs w:val="20"/>
-        </w:rPr>
-        <w:t xml:space="preserve"> </w:t>
-      </w:r>
-      <w:r>
-        <w:rPr>
-          <w:rFonts w:ascii="Arial" w:hAnsi="Arial" w:cs="Arial"/>
-          <w:sz w:val="20"/>
-          <w:szCs w:val="20"/>
-        </w:rPr>
-        <w:t>curso de EDUCACIÓN SECU</w:t>
-      </w:r>
-      <w:r>
-        <w:rPr>
-          <w:rFonts w:ascii="Arial" w:hAnsi="Arial" w:cs="Arial"/>
-          <w:sz w:val="20"/>
-          <w:szCs w:val="20"/>
-        </w:rPr>
-        <w:t>NDARIA OBLIGATORIA (LOMLOE)(</w:t>
-      </w:r>
-      <w:r>
-        <w:rPr>
-          <w:rFonts w:ascii="Arial" w:hAnsi="Arial" w:cs="Arial"/>
-          <w:sz w:val="20"/>
-          <w:szCs w:val="20"/>
-        </w:rPr>
-        <w:t>&lt;&lt;</w:t>
-      </w:r>
-      <w:proofErr w:type="spellStart"/>
       <w:r>
         <w:rPr>
           <w:rFonts w:ascii="Arial" w:hAnsi="Arial" w:cs="Arial"/>
@@ -326,7 +307,6 @@
         </w:rPr>
         <w:t>grupoAlumno</w:t>
       </w:r>
-      <w:proofErr w:type="spellEnd"/>
       <w:r>
         <w:rPr>
           <w:rFonts w:ascii="Arial" w:hAnsi="Arial" w:cs="Arial"/>
@@ -367,7 +347,6 @@
         </w:rPr>
         <w:t>&lt;&lt;</w:t>
       </w:r>
-      <w:proofErr w:type="spellStart"/>
       <w:r>
         <w:rPr>
           <w:rFonts w:ascii="Arial" w:hAnsi="Arial" w:cs="Arial"/>
@@ -378,7 +357,6 @@
         </w:rPr>
         <w:t>diaHechos</w:t>
       </w:r>
-      <w:proofErr w:type="spellEnd"/>
       <w:r>
         <w:rPr>
           <w:rFonts w:ascii="Arial" w:hAnsi="Arial" w:cs="Arial"/>
@@ -403,7 +381,6 @@
         </w:rPr>
         <w:t>&lt;&lt;</w:t>
       </w:r>
-      <w:proofErr w:type="spellStart"/>
       <w:r>
         <w:rPr>
           <w:rFonts w:ascii="Arial" w:hAnsi="Arial" w:cs="Arial"/>
@@ -414,7 +391,6 @@
         </w:rPr>
         <w:t>mesHechos</w:t>
       </w:r>
-      <w:proofErr w:type="spellEnd"/>
       <w:r>
         <w:rPr>
           <w:rFonts w:ascii="Arial" w:hAnsi="Arial" w:cs="Arial"/>
@@ -686,58 +662,6 @@
         <w:autoSpaceDN w:val="0"/>
         <w:adjustRightInd w:val="0"/>
         <w:spacing w:after="0" w:line="240" w:lineRule="auto"/>
-        <w:rPr>
-          <w:rFonts w:ascii="Arial" w:hAnsi="Arial" w:cs="Arial"/>
-          <w:sz w:val="20"/>
-          <w:szCs w:val="20"/>
-        </w:rPr>
-      </w:pPr>
-    </w:p>
-    <w:p>
-      <w:pPr>
-        <w:autoSpaceDE w:val="0"/>
-        <w:autoSpaceDN w:val="0"/>
-        <w:adjustRightInd w:val="0"/>
-        <w:spacing w:after="0" w:line="240" w:lineRule="auto"/>
-        <w:rPr>
-          <w:rFonts w:ascii="Arial" w:hAnsi="Arial" w:cs="Arial"/>
-          <w:sz w:val="20"/>
-          <w:szCs w:val="20"/>
-        </w:rPr>
-      </w:pPr>
-    </w:p>
-    <w:p>
-      <w:pPr>
-        <w:autoSpaceDE w:val="0"/>
-        <w:autoSpaceDN w:val="0"/>
-        <w:adjustRightInd w:val="0"/>
-        <w:spacing w:after="0" w:line="240" w:lineRule="auto"/>
-        <w:rPr>
-          <w:rFonts w:ascii="Arial" w:hAnsi="Arial" w:cs="Arial"/>
-          <w:sz w:val="20"/>
-          <w:szCs w:val="20"/>
-        </w:rPr>
-      </w:pPr>
-    </w:p>
-    <w:p>
-      <w:pPr>
-        <w:autoSpaceDE w:val="0"/>
-        <w:autoSpaceDN w:val="0"/>
-        <w:adjustRightInd w:val="0"/>
-        <w:spacing w:after="0" w:line="240" w:lineRule="auto"/>
-        <w:rPr>
-          <w:rFonts w:ascii="Arial" w:hAnsi="Arial" w:cs="Arial"/>
-          <w:sz w:val="20"/>
-          <w:szCs w:val="20"/>
-        </w:rPr>
-      </w:pPr>
-    </w:p>
-    <w:p>
-      <w:pPr>
-        <w:autoSpaceDE w:val="0"/>
-        <w:autoSpaceDN w:val="0"/>
-        <w:adjustRightInd w:val="0"/>
-        <w:spacing w:after="0" w:line="240" w:lineRule="auto"/>
         <w:jc w:val="center"/>
         <w:rPr>
           <w:rFonts w:ascii="Arial" w:hAnsi="Arial" w:cs="Arial"/>
@@ -831,25 +755,7 @@
           <w:sz w:val="16"/>
           <w:szCs w:val="16"/>
         </w:rPr>
-        <w:t>&lt;&lt;</w:t>
-      </w:r>
-      <w:proofErr w:type="spellStart"/>
-      <w:r>
-        <w:rPr>
-          <w:rFonts w:ascii="Arial" w:hAnsi="Arial" w:cs="Arial"/>
-          <w:sz w:val="16"/>
-          <w:szCs w:val="16"/>
-        </w:rPr>
-        <w:t>firmaVisible</w:t>
-      </w:r>
-      <w:proofErr w:type="spellEnd"/>
-      <w:r>
-        <w:rPr>
-          <w:rFonts w:ascii="Arial" w:hAnsi="Arial" w:cs="Arial"/>
-          <w:sz w:val="16"/>
-          <w:szCs w:val="16"/>
-        </w:rPr>
-        <w:t>&gt;&gt;</w:t>
+        <w:t>&lt;&lt;firmaVisible&gt;&gt;</w:t>
       </w:r>
     </w:p>
     <w:p>
@@ -2312,6 +2218,25 @@
 </file>
 
 <file path=customXml/item1.xml><?xml version="1.0" encoding="utf-8"?>
+<p:properties xmlns:p="http://schemas.microsoft.com/office/2006/metadata/properties" xmlns:xsi="http://www.w3.org/2001/XMLSchema-instance" xmlns:pc="http://schemas.microsoft.com/office/infopath/2007/PartnerControls">
+  <documentManagement>
+    <lcf76f155ced4ddcb4097134ff3c332f xmlns="c8a3e049-7505-4416-9a92-b091f6792637">
+      <Terms xmlns="http://schemas.microsoft.com/office/infopath/2007/PartnerControls"/>
+    </lcf76f155ced4ddcb4097134ff3c332f>
+  </documentManagement>
+</p:properties>
+</file>
+
+<file path=customXml/item2.xml><?xml version="1.0" encoding="utf-8"?>
+<?mso-contentType ?>
+<FormTemplates xmlns="http://schemas.microsoft.com/sharepoint/v3/contenttype/forms">
+  <Display>DocumentLibraryForm</Display>
+  <Edit>DocumentLibraryForm</Edit>
+  <New>DocumentLibraryForm</New>
+</FormTemplates>
+</file>
+
+<file path=customXml/item3.xml><?xml version="1.0" encoding="utf-8"?>
 <ct:contentTypeSchema xmlns:ct="http://schemas.microsoft.com/office/2006/metadata/contentType" xmlns:ma="http://schemas.microsoft.com/office/2006/metadata/properties/metaAttributes" ct:_="" ma:_="" ma:contentTypeName="Documento" ma:contentTypeID="0x010100BE5E44177913B140848DC48051328551" ma:contentTypeVersion="10" ma:contentTypeDescription="Crear nuevo documento." ma:contentTypeScope="" ma:versionID="e56293935e30344837f372b4cf6c3dd2">
   <xsd:schema xmlns:xsd="http://www.w3.org/2001/XMLSchema" xmlns:xs="http://www.w3.org/2001/XMLSchema" xmlns:p="http://schemas.microsoft.com/office/2006/metadata/properties" xmlns:ns2="c8a3e049-7505-4416-9a92-b091f6792637" targetNamespace="http://schemas.microsoft.com/office/2006/metadata/properties" ma:root="true" ma:fieldsID="dd180e20af6143d6ed5990269d1f6a3c" ns2:_="">
     <xsd:import namespace="c8a3e049-7505-4416-9a92-b091f6792637"/>
@@ -2489,26 +2414,25 @@
 </ct:contentTypeSchema>
 </file>
 
-<file path=customXml/item2.xml><?xml version="1.0" encoding="utf-8"?>
-<?mso-contentType ?>
-<FormTemplates xmlns="http://schemas.microsoft.com/sharepoint/v3/contenttype/forms">
-  <Display>DocumentLibraryForm</Display>
-  <Edit>DocumentLibraryForm</Edit>
-  <New>DocumentLibraryForm</New>
-</FormTemplates>
+<file path=customXml/itemProps1.xml><?xml version="1.0" encoding="utf-8"?>
+<ds:datastoreItem xmlns:ds="http://schemas.openxmlformats.org/officeDocument/2006/customXml" ds:itemID="{8A1EC71C-7278-4122-A4AD-C66384243BA9}">
+  <ds:schemaRefs>
+    <ds:schemaRef ds:uri="http://schemas.microsoft.com/office/2006/metadata/properties"/>
+    <ds:schemaRef ds:uri="http://schemas.microsoft.com/office/infopath/2007/PartnerControls"/>
+    <ds:schemaRef ds:uri="c8a3e049-7505-4416-9a92-b091f6792637"/>
+  </ds:schemaRefs>
+</ds:datastoreItem>
 </file>
 
-<file path=customXml/item3.xml><?xml version="1.0" encoding="utf-8"?>
-<p:properties xmlns:p="http://schemas.microsoft.com/office/2006/metadata/properties" xmlns:xsi="http://www.w3.org/2001/XMLSchema-instance" xmlns:pc="http://schemas.microsoft.com/office/infopath/2007/PartnerControls">
-  <documentManagement>
-    <lcf76f155ced4ddcb4097134ff3c332f xmlns="c8a3e049-7505-4416-9a92-b091f6792637">
-      <Terms xmlns="http://schemas.microsoft.com/office/infopath/2007/PartnerControls"/>
-    </lcf76f155ced4ddcb4097134ff3c332f>
-  </documentManagement>
-</p:properties>
+<file path=customXml/itemProps2.xml><?xml version="1.0" encoding="utf-8"?>
+<ds:datastoreItem xmlns:ds="http://schemas.openxmlformats.org/officeDocument/2006/customXml" ds:itemID="{D61C9197-6EA3-43EA-BE01-C71ABA224B03}">
+  <ds:schemaRefs>
+    <ds:schemaRef ds:uri="http://schemas.microsoft.com/sharepoint/v3/contenttype/forms"/>
+  </ds:schemaRefs>
+</ds:datastoreItem>
 </file>
 
-<file path=customXml/itemProps1.xml><?xml version="1.0" encoding="utf-8"?>
+<file path=customXml/itemProps3.xml><?xml version="1.0" encoding="utf-8"?>
 <ds:datastoreItem xmlns:ds="http://schemas.openxmlformats.org/officeDocument/2006/customXml" ds:itemID="{041939B1-E4EA-4FE9-B833-C78C58B8169E}">
   <ds:schemaRefs>
     <ds:schemaRef ds:uri="http://schemas.microsoft.com/office/2006/metadata/contentType"/>
@@ -2524,22 +2448,4 @@
     <ds:schemaRef ds:uri="http://schemas.microsoft.com/internal/obd"/>
   </ds:schemaRefs>
 </ds:datastoreItem>
-</file>
-
-<file path=customXml/itemProps2.xml><?xml version="1.0" encoding="utf-8"?>
-<ds:datastoreItem xmlns:ds="http://schemas.openxmlformats.org/officeDocument/2006/customXml" ds:itemID="{D61C9197-6EA3-43EA-BE01-C71ABA224B03}">
-  <ds:schemaRefs>
-    <ds:schemaRef ds:uri="http://schemas.microsoft.com/sharepoint/v3/contenttype/forms"/>
-  </ds:schemaRefs>
-</ds:datastoreItem>
-</file>
-
-<file path=customXml/itemProps3.xml><?xml version="1.0" encoding="utf-8"?>
-<ds:datastoreItem xmlns:ds="http://schemas.openxmlformats.org/officeDocument/2006/customXml" ds:itemID="{8A1EC71C-7278-4122-A4AD-C66384243BA9}">
-  <ds:schemaRefs>
-    <ds:schemaRef ds:uri="http://schemas.microsoft.com/office/2006/metadata/properties"/>
-    <ds:schemaRef ds:uri="http://schemas.microsoft.com/office/infopath/2007/PartnerControls"/>
-    <ds:schemaRef ds:uri="c8a3e049-7505-4416-9a92-b091f6792637"/>
-  </ds:schemaRefs>
-</ds:datastoreItem>
 </file>
</xml_diff>

<commit_message>
Update expediente start template
</commit_message>
<xml_diff>
--- a/01 - Sanción Incio Expediente.docx
+++ b/01 - Sanción Incio Expediente.docx
@@ -263,7 +263,25 @@
           <w:sz w:val="20"/>
           <w:szCs w:val="20"/>
         </w:rPr>
-        <w:t>&lt;&lt;cursoAlumno&gt;&gt;</w:t>
+        <w:t>&lt;&lt;</w:t>
+      </w:r>
+      <w:proofErr w:type="spellStart"/>
+      <w:r>
+        <w:rPr>
+          <w:rFonts w:ascii="Arial" w:hAnsi="Arial" w:cs="Arial"/>
+          <w:sz w:val="20"/>
+          <w:szCs w:val="20"/>
+        </w:rPr>
+        <w:t>cursoAlumno</w:t>
+      </w:r>
+      <w:proofErr w:type="spellEnd"/>
+      <w:r>
+        <w:rPr>
+          <w:rFonts w:ascii="Arial" w:hAnsi="Arial" w:cs="Arial"/>
+          <w:sz w:val="20"/>
+          <w:szCs w:val="20"/>
+        </w:rPr>
+        <w:t>&gt;&gt;</w:t>
       </w:r>
       <w:r>
         <w:rPr>
@@ -297,6 +315,7 @@
         </w:rPr>
         <w:t>&lt;&lt;</w:t>
       </w:r>
+      <w:proofErr w:type="spellStart"/>
       <w:r>
         <w:rPr>
           <w:rFonts w:ascii="Arial" w:hAnsi="Arial" w:cs="Arial"/>
@@ -307,6 +326,7 @@
         </w:rPr>
         <w:t>grupoAlumno</w:t>
       </w:r>
+      <w:proofErr w:type="spellEnd"/>
       <w:r>
         <w:rPr>
           <w:rFonts w:ascii="Arial" w:hAnsi="Arial" w:cs="Arial"/>
@@ -347,6 +367,7 @@
         </w:rPr>
         <w:t>&lt;&lt;</w:t>
       </w:r>
+      <w:proofErr w:type="spellStart"/>
       <w:r>
         <w:rPr>
           <w:rFonts w:ascii="Arial" w:hAnsi="Arial" w:cs="Arial"/>
@@ -357,6 +378,7 @@
         </w:rPr>
         <w:t>diaHechos</w:t>
       </w:r>
+      <w:proofErr w:type="spellEnd"/>
       <w:r>
         <w:rPr>
           <w:rFonts w:ascii="Arial" w:hAnsi="Arial" w:cs="Arial"/>
@@ -381,6 +403,7 @@
         </w:rPr>
         <w:t>&lt;&lt;</w:t>
       </w:r>
+      <w:proofErr w:type="spellStart"/>
       <w:r>
         <w:rPr>
           <w:rFonts w:ascii="Arial" w:hAnsi="Arial" w:cs="Arial"/>
@@ -391,6 +414,7 @@
         </w:rPr>
         <w:t>mesHechos</w:t>
       </w:r>
+      <w:proofErr w:type="spellEnd"/>
       <w:r>
         <w:rPr>
           <w:rFonts w:ascii="Arial" w:hAnsi="Arial" w:cs="Arial"/>
@@ -755,7 +779,25 @@
           <w:sz w:val="16"/>
           <w:szCs w:val="16"/>
         </w:rPr>
-        <w:t>&lt;&lt;firmaVisible&gt;&gt;</w:t>
+        <w:t>&lt;&lt;</w:t>
+      </w:r>
+      <w:proofErr w:type="spellStart"/>
+      <w:r>
+        <w:rPr>
+          <w:rFonts w:ascii="Arial" w:hAnsi="Arial" w:cs="Arial"/>
+          <w:sz w:val="16"/>
+          <w:szCs w:val="16"/>
+        </w:rPr>
+        <w:t>firmaVisible</w:t>
+      </w:r>
+      <w:proofErr w:type="spellEnd"/>
+      <w:r>
+        <w:rPr>
+          <w:rFonts w:ascii="Arial" w:hAnsi="Arial" w:cs="Arial"/>
+          <w:sz w:val="16"/>
+          <w:szCs w:val="16"/>
+        </w:rPr>
+        <w:t>&gt;&gt;</w:t>
       </w:r>
     </w:p>
     <w:p>
@@ -893,71 +935,6 @@
         </w:rPr>
         <w:t>: JOSÉ MANUEL RODRÍGUEZ GARCÍA</w:t>
       </w:r>
-    </w:p>
-    <w:p>
-      <w:pPr>
-        <w:autoSpaceDE w:val="0"/>
-        <w:autoSpaceDN w:val="0"/>
-        <w:adjustRightInd w:val="0"/>
-        <w:spacing w:after="0" w:line="240" w:lineRule="auto"/>
-        <w:rPr>
-          <w:rFonts w:ascii="Arial" w:hAnsi="Arial" w:cs="Arial"/>
-          <w:sz w:val="16"/>
-          <w:szCs w:val="16"/>
-        </w:rPr>
-      </w:pPr>
-    </w:p>
-    <w:p>
-      <w:pPr>
-        <w:autoSpaceDE w:val="0"/>
-        <w:autoSpaceDN w:val="0"/>
-        <w:adjustRightInd w:val="0"/>
-        <w:spacing w:after="0" w:line="240" w:lineRule="auto"/>
-        <w:rPr>
-          <w:rFonts w:ascii="Arial" w:hAnsi="Arial" w:cs="Arial"/>
-          <w:sz w:val="16"/>
-          <w:szCs w:val="16"/>
-        </w:rPr>
-      </w:pPr>
-    </w:p>
-    <w:p>
-      <w:pPr>
-        <w:autoSpaceDE w:val="0"/>
-        <w:autoSpaceDN w:val="0"/>
-        <w:adjustRightInd w:val="0"/>
-        <w:spacing w:after="0" w:line="240" w:lineRule="auto"/>
-        <w:rPr>
-          <w:rFonts w:ascii="Arial" w:hAnsi="Arial" w:cs="Arial"/>
-          <w:sz w:val="16"/>
-          <w:szCs w:val="16"/>
-        </w:rPr>
-      </w:pPr>
-    </w:p>
-    <w:p>
-      <w:pPr>
-        <w:autoSpaceDE w:val="0"/>
-        <w:autoSpaceDN w:val="0"/>
-        <w:adjustRightInd w:val="0"/>
-        <w:spacing w:after="0" w:line="240" w:lineRule="auto"/>
-        <w:rPr>
-          <w:rFonts w:ascii="Arial" w:hAnsi="Arial" w:cs="Arial"/>
-          <w:sz w:val="16"/>
-          <w:szCs w:val="16"/>
-        </w:rPr>
-      </w:pPr>
-    </w:p>
-    <w:p>
-      <w:pPr>
-        <w:autoSpaceDE w:val="0"/>
-        <w:autoSpaceDN w:val="0"/>
-        <w:adjustRightInd w:val="0"/>
-        <w:spacing w:after="0" w:line="240" w:lineRule="auto"/>
-        <w:rPr>
-          <w:rFonts w:ascii="Arial" w:hAnsi="Arial" w:cs="Arial"/>
-          <w:sz w:val="16"/>
-          <w:szCs w:val="16"/>
-        </w:rPr>
-      </w:pPr>
     </w:p>
     <w:p>
       <w:pPr>
@@ -2218,25 +2195,6 @@
 </file>
 
 <file path=customXml/item1.xml><?xml version="1.0" encoding="utf-8"?>
-<p:properties xmlns:p="http://schemas.microsoft.com/office/2006/metadata/properties" xmlns:xsi="http://www.w3.org/2001/XMLSchema-instance" xmlns:pc="http://schemas.microsoft.com/office/infopath/2007/PartnerControls">
-  <documentManagement>
-    <lcf76f155ced4ddcb4097134ff3c332f xmlns="c8a3e049-7505-4416-9a92-b091f6792637">
-      <Terms xmlns="http://schemas.microsoft.com/office/infopath/2007/PartnerControls"/>
-    </lcf76f155ced4ddcb4097134ff3c332f>
-  </documentManagement>
-</p:properties>
-</file>
-
-<file path=customXml/item2.xml><?xml version="1.0" encoding="utf-8"?>
-<?mso-contentType ?>
-<FormTemplates xmlns="http://schemas.microsoft.com/sharepoint/v3/contenttype/forms">
-  <Display>DocumentLibraryForm</Display>
-  <Edit>DocumentLibraryForm</Edit>
-  <New>DocumentLibraryForm</New>
-</FormTemplates>
-</file>
-
-<file path=customXml/item3.xml><?xml version="1.0" encoding="utf-8"?>
 <ct:contentTypeSchema xmlns:ct="http://schemas.microsoft.com/office/2006/metadata/contentType" xmlns:ma="http://schemas.microsoft.com/office/2006/metadata/properties/metaAttributes" ct:_="" ma:_="" ma:contentTypeName="Documento" ma:contentTypeID="0x010100BE5E44177913B140848DC48051328551" ma:contentTypeVersion="10" ma:contentTypeDescription="Crear nuevo documento." ma:contentTypeScope="" ma:versionID="e56293935e30344837f372b4cf6c3dd2">
   <xsd:schema xmlns:xsd="http://www.w3.org/2001/XMLSchema" xmlns:xs="http://www.w3.org/2001/XMLSchema" xmlns:p="http://schemas.microsoft.com/office/2006/metadata/properties" xmlns:ns2="c8a3e049-7505-4416-9a92-b091f6792637" targetNamespace="http://schemas.microsoft.com/office/2006/metadata/properties" ma:root="true" ma:fieldsID="dd180e20af6143d6ed5990269d1f6a3c" ns2:_="">
     <xsd:import namespace="c8a3e049-7505-4416-9a92-b091f6792637"/>
@@ -2414,25 +2372,26 @@
 </ct:contentTypeSchema>
 </file>
 
-<file path=customXml/itemProps1.xml><?xml version="1.0" encoding="utf-8"?>
-<ds:datastoreItem xmlns:ds="http://schemas.openxmlformats.org/officeDocument/2006/customXml" ds:itemID="{8A1EC71C-7278-4122-A4AD-C66384243BA9}">
-  <ds:schemaRefs>
-    <ds:schemaRef ds:uri="http://schemas.microsoft.com/office/2006/metadata/properties"/>
-    <ds:schemaRef ds:uri="http://schemas.microsoft.com/office/infopath/2007/PartnerControls"/>
-    <ds:schemaRef ds:uri="c8a3e049-7505-4416-9a92-b091f6792637"/>
-  </ds:schemaRefs>
-</ds:datastoreItem>
+<file path=customXml/item2.xml><?xml version="1.0" encoding="utf-8"?>
+<?mso-contentType ?>
+<FormTemplates xmlns="http://schemas.microsoft.com/sharepoint/v3/contenttype/forms">
+  <Display>DocumentLibraryForm</Display>
+  <Edit>DocumentLibraryForm</Edit>
+  <New>DocumentLibraryForm</New>
+</FormTemplates>
 </file>
 
-<file path=customXml/itemProps2.xml><?xml version="1.0" encoding="utf-8"?>
-<ds:datastoreItem xmlns:ds="http://schemas.openxmlformats.org/officeDocument/2006/customXml" ds:itemID="{D61C9197-6EA3-43EA-BE01-C71ABA224B03}">
-  <ds:schemaRefs>
-    <ds:schemaRef ds:uri="http://schemas.microsoft.com/sharepoint/v3/contenttype/forms"/>
-  </ds:schemaRefs>
-</ds:datastoreItem>
+<file path=customXml/item3.xml><?xml version="1.0" encoding="utf-8"?>
+<p:properties xmlns:p="http://schemas.microsoft.com/office/2006/metadata/properties" xmlns:xsi="http://www.w3.org/2001/XMLSchema-instance" xmlns:pc="http://schemas.microsoft.com/office/infopath/2007/PartnerControls">
+  <documentManagement>
+    <lcf76f155ced4ddcb4097134ff3c332f xmlns="c8a3e049-7505-4416-9a92-b091f6792637">
+      <Terms xmlns="http://schemas.microsoft.com/office/infopath/2007/PartnerControls"/>
+    </lcf76f155ced4ddcb4097134ff3c332f>
+  </documentManagement>
+</p:properties>
 </file>
 
-<file path=customXml/itemProps3.xml><?xml version="1.0" encoding="utf-8"?>
+<file path=customXml/itemProps1.xml><?xml version="1.0" encoding="utf-8"?>
 <ds:datastoreItem xmlns:ds="http://schemas.openxmlformats.org/officeDocument/2006/customXml" ds:itemID="{041939B1-E4EA-4FE9-B833-C78C58B8169E}">
   <ds:schemaRefs>
     <ds:schemaRef ds:uri="http://schemas.microsoft.com/office/2006/metadata/contentType"/>
@@ -2448,4 +2407,22 @@
     <ds:schemaRef ds:uri="http://schemas.microsoft.com/internal/obd"/>
   </ds:schemaRefs>
 </ds:datastoreItem>
+</file>
+
+<file path=customXml/itemProps2.xml><?xml version="1.0" encoding="utf-8"?>
+<ds:datastoreItem xmlns:ds="http://schemas.openxmlformats.org/officeDocument/2006/customXml" ds:itemID="{D61C9197-6EA3-43EA-BE01-C71ABA224B03}">
+  <ds:schemaRefs>
+    <ds:schemaRef ds:uri="http://schemas.microsoft.com/sharepoint/v3/contenttype/forms"/>
+  </ds:schemaRefs>
+</ds:datastoreItem>
+</file>
+
+<file path=customXml/itemProps3.xml><?xml version="1.0" encoding="utf-8"?>
+<ds:datastoreItem xmlns:ds="http://schemas.openxmlformats.org/officeDocument/2006/customXml" ds:itemID="{8A1EC71C-7278-4122-A4AD-C66384243BA9}">
+  <ds:schemaRefs>
+    <ds:schemaRef ds:uri="http://schemas.microsoft.com/office/2006/metadata/properties"/>
+    <ds:schemaRef ds:uri="http://schemas.microsoft.com/office/infopath/2007/PartnerControls"/>
+    <ds:schemaRef ds:uri="c8a3e049-7505-4416-9a92-b091f6792637"/>
+  </ds:schemaRefs>
+</ds:datastoreItem>
 </file>
</xml_diff>